<commit_message>
cap nhat template Times New Roman
</commit_message>
<xml_diff>
--- a/backend/templates/template.docx
+++ b/backend/templates/template.docx
@@ -90,6 +90,7 @@
       </w:r>
       <w:r>
         <w:rPr>
+          <w:rFonts w:ascii="Times New Roman" w:eastAsia="Times New Roman" w:hAnsi="Times New Roman" w:cs="Times New Roman"/>
           <w:b/>
           <w:bCs/>
           <w:spacing w:val="29"/>
@@ -127,6 +128,7 @@
       </w:r>
       <w:r>
         <w:rPr>
+          <w:rFonts w:ascii="Times New Roman" w:eastAsia="Times New Roman" w:hAnsi="Times New Roman" w:cs="Times New Roman"/>
           <w:b/>
           <w:bCs/>
           <w:lang w:val="en-US"/>
@@ -166,6 +168,7 @@
       </w:r>
       <w:r>
         <w:rPr>
+          <w:rFonts w:ascii="Times New Roman" w:eastAsia="Times New Roman" w:hAnsi="Times New Roman" w:cs="Times New Roman"/>
           <w:b/>
           <w:bCs/>
           <w:spacing w:val="-4"/>
@@ -257,6 +260,7 @@
       </w:r>
       <w:r>
         <w:rPr>
+          <w:rFonts w:ascii="Times New Roman" w:eastAsia="Times New Roman" w:hAnsi="Times New Roman" w:cs="Times New Roman"/>
           <w:b/>
           <w:lang w:val="en-US"/>
         </w:rPr>
@@ -464,6 +468,7 @@
       </w:r>
       <w:r>
         <w:rPr>
+          <w:rFonts w:ascii="Times New Roman" w:eastAsia="Times New Roman" w:hAnsi="Times New Roman" w:cs="Times New Roman"/>
           <w:b/>
           <w:lang w:val="en-US"/>
         </w:rPr>
@@ -1304,6 +1309,7 @@
             </w:pPr>
             <w:r>
               <w:rPr>
+                <w:rFonts w:ascii="Times New Roman" w:eastAsia="Times New Roman" w:hAnsi="Times New Roman" w:cs="Times New Roman"/>
                 <w:b/>
                 <w:spacing w:val="-2"/>
                 <w:sz w:val="24"/>
@@ -1399,6 +1405,7 @@
             </w:pPr>
             <w:r>
               <w:rPr>
+                <w:rFonts w:ascii="Times New Roman" w:eastAsia="Times New Roman" w:hAnsi="Times New Roman" w:cs="Times New Roman"/>
                 <w:b/>
                 <w:spacing w:val="-2"/>
                 <w:sz w:val="24"/>
@@ -5061,6 +5068,7 @@
             </w:pPr>
             <w:r>
               <w:rPr>
+                <w:rFonts w:ascii="Times New Roman" w:eastAsia="Times New Roman" w:hAnsi="Times New Roman" w:cs="Times New Roman"/>
                 <w:b/>
                 <w:sz w:val="24"/>
                 <w:lang w:val="en-US"/>
@@ -5115,6 +5123,7 @@
             </w:pPr>
             <w:r>
               <w:rPr>
+                <w:rFonts w:ascii="Times New Roman" w:eastAsia="Times New Roman" w:hAnsi="Times New Roman" w:cs="Times New Roman"/>
                 <w:b/>
                 <w:spacing w:val="-2"/>
                 <w:sz w:val="24"/>
@@ -5277,6 +5286,7 @@
             </w:pPr>
             <w:r>
               <w:rPr>
+                <w:rFonts w:ascii="Times New Roman" w:eastAsia="Times New Roman" w:hAnsi="Times New Roman" w:cs="Times New Roman"/>
                 <w:b/>
                 <w:sz w:val="24"/>
                 <w:lang w:val="en-US"/>
@@ -5332,6 +5342,7 @@
             <w:bookmarkStart w:id="0" w:name="_GoBack"/>
             <w:r>
               <w:rPr>
+                <w:rFonts w:ascii="Times New Roman" w:eastAsia="Times New Roman" w:hAnsi="Times New Roman" w:cs="Times New Roman"/>
                 <w:b/>
                 <w:spacing w:val="-2"/>
                 <w:sz w:val="24"/>

</xml_diff>